<commit_message>
Update title page: add author names and affiliations
</commit_message>
<xml_diff>
--- a/manuscript/CRC_Title_Page.docx
+++ b/manuscript/CRC_Title_Page.docx
@@ -57,7 +57,7 @@
           <w:sz w:val="24"/>
           <w:szCs w:val="24"/>
         </w:rPr>
-        <w:t xml:space="preserve">Alejandro Schroeder^1,*^, [Co-author Name]^1^</w:t>
+        <w:t xml:space="preserve">Alejandro Velazquez^1,*^, Rachel Selbrede^2^</w:t>
       </w:r>
     </w:p>
     <w:p>
@@ -79,6 +79,22 @@
           <w:szCs w:val="22"/>
         </w:rPr>
         <w:t xml:space="preserve">^1^ University of California, Berkeley, CA, USA</w:t>
+      </w:r>
+    </w:p>
+    <w:p>
+      <w:pPr>
+        <w:spacing w:after="120" w:line="480"/>
+        <w:jc w:val="center"/>
+      </w:pPr>
+      <w:r>
+        <w:rPr>
+          <w:rFonts w:ascii="Times New Roman" w:cs="Times New Roman" w:eastAsia="Times New Roman" w:hAnsi="Times New Roman"/>
+          <w:b w:val="false"/>
+          <w:bCs w:val="false"/>
+          <w:sz w:val="22"/>
+          <w:szCs w:val="22"/>
+        </w:rPr>
+        <w:t xml:space="preserve">^2^ California State University San Marcos, San Marcos, CA, USA</w:t>
       </w:r>
     </w:p>
     <w:p>

</xml_diff>